<commit_message>
Reframe Q-Signals as sentiment research platform
</commit_message>
<xml_diff>
--- a/resume-michael-valente.docx
+++ b/resume-michael-valente.docx
@@ -69,7 +69,7 @@
         </w:rPr>
         <w:t xml:space="preserve">  |  </w:t>
       </w:r>
-      <w:hyperlink w:history="1" r:id="rIdassv9ndsntghoyhsdv3ym">
+      <w:hyperlink w:history="1" r:id="rIdc2tzegptztc2lr2nqh-2f">
         <w:r>
           <w:rPr>
             <w:rFonts w:ascii="Calibri" w:cs="Calibri" w:eastAsia="Calibri" w:hAnsi="Calibri"/>
@@ -90,7 +90,7 @@
         </w:rPr>
         <w:t xml:space="preserve">  |  </w:t>
       </w:r>
-      <w:hyperlink w:history="1" r:id="rIdwkou11p9mrfn3f-cxax6c">
+      <w:hyperlink w:history="1" r:id="rIdbvogcplbfdr57as4re7ka">
         <w:r>
           <w:rPr>
             <w:rFonts w:ascii="Calibri" w:cs="Calibri" w:eastAsia="Calibri" w:hAnsi="Calibri"/>
@@ -111,7 +111,7 @@
         </w:rPr>
         <w:t xml:space="preserve">  |  </w:t>
       </w:r>
-      <w:hyperlink w:history="1" r:id="rId4fikdkea4k3ojtfazvia6">
+      <w:hyperlink w:history="1" r:id="rId4dqhnyqnasvri3xdfatwb">
         <w:r>
           <w:rPr>
             <w:rFonts w:ascii="Calibri" w:cs="Calibri" w:eastAsia="Calibri" w:hAnsi="Calibri"/>
@@ -395,7 +395,7 @@
         </w:rPr>
         <w:t xml:space="preserve">	</w:t>
       </w:r>
-      <w:hyperlink w:history="1" r:id="rIdzlldx8tjgyjxwk5jh2hb0">
+      <w:hyperlink w:history="1" r:id="rIdpgeqnec3jhuvu8r2m8lgp">
         <w:r>
           <w:rPr>
             <w:rFonts w:ascii="Calibri" w:cs="Calibri" w:eastAsia="Calibri" w:hAnsi="Calibri"/>
@@ -535,7 +535,7 @@
           <w:sz w:val="21"/>
           <w:szCs w:val="21"/>
         </w:rPr>
-        <w:t xml:space="preserve">Q-Signals — 41-Module AI Stock Signal Platform</w:t>
+        <w:t xml:space="preserve">Q-Signals — AI-Powered Market Sentiment Research Platform</w:t>
       </w:r>
       <w:r>
         <w:rPr>
@@ -543,7 +543,7 @@
         </w:rPr>
         <w:t xml:space="preserve">	</w:t>
       </w:r>
-      <w:hyperlink w:history="1" r:id="rIdk4kbzuzvkytjjmyxrb1je">
+      <w:hyperlink w:history="1" r:id="rId9xuf7yjvavsh5awyli_1x">
         <w:r>
           <w:rPr>
             <w:rFonts w:ascii="Calibri" w:cs="Calibri" w:eastAsia="Calibri" w:hAnsi="Calibri"/>
@@ -569,102 +569,102 @@
           <w:sz w:val="19"/>
           <w:szCs w:val="19"/>
         </w:rPr>
-        <w:t xml:space="preserve">Python · PyTorch · FastAPI · Supabase · Capacitor 6 · Android · HTML / CSS / JS</w:t>
-      </w:r>
-    </w:p>
-    <w:p>
-      <w:pPr>
-        <w:pStyle w:val="ListParagraph"/>
-        <w:numPr>
-          <w:ilvl w:val="0"/>
-          <w:numId w:val="2"/>
-        </w:numPr>
-        <w:spacing w:after="28" w:before="28"/>
-      </w:pPr>
-      <w:r>
-        <w:rPr>
-          <w:rFonts w:ascii="Calibri" w:cs="Calibri" w:eastAsia="Calibri" w:hAnsi="Calibri"/>
-          <w:color w:val="1A1A1A"/>
-          <w:sz w:val="20"/>
-          <w:szCs w:val="20"/>
-        </w:rPr>
-        <w:t xml:space="preserve">Designed a Dual-Gate Consensus system: a signal is issued only when |composite score| ≥ ±0.10 AND ≥60% of 41 modules agree — eliminating false positives from any single noisy indicator</w:t>
-      </w:r>
-    </w:p>
-    <w:p>
-      <w:pPr>
-        <w:pStyle w:val="ListParagraph"/>
-        <w:numPr>
-          <w:ilvl w:val="0"/>
-          <w:numId w:val="2"/>
-        </w:numPr>
-        <w:spacing w:after="28" w:before="28"/>
-      </w:pPr>
-      <w:r>
-        <w:rPr>
-          <w:rFonts w:ascii="Calibri" w:cs="Calibri" w:eastAsia="Calibri" w:hAnsi="Calibri"/>
-          <w:color w:val="1A1A1A"/>
-          <w:sz w:val="20"/>
-          <w:szCs w:val="20"/>
-        </w:rPr>
-        <w:t xml:space="preserve">41 modules span Elliott Wave, Fibonacci, 61 TA-Lib candlestick patterns, SEC EDGAR (insider/institutional 13F filings), FRED macro data, Reddit/StockTwits sentiment, earnings surprise, supply chain (EDGAR), and congressional trade activity</w:t>
-      </w:r>
-    </w:p>
-    <w:p>
-      <w:pPr>
-        <w:pStyle w:val="ListParagraph"/>
-        <w:numPr>
-          <w:ilvl w:val="0"/>
-          <w:numId w:val="2"/>
-        </w:numPr>
-        <w:spacing w:after="28" w:before="28"/>
-      </w:pPr>
-      <w:r>
-        <w:rPr>
-          <w:rFonts w:ascii="Calibri" w:cs="Calibri" w:eastAsia="Calibri" w:hAnsi="Calibri"/>
-          <w:color w:val="1A1A1A"/>
-          <w:sz w:val="20"/>
-          <w:szCs w:val="20"/>
-        </w:rPr>
-        <w:t xml:space="preserve">DQN agent (18K parameters, PyTorch) learns from T1/T2/T3 ATR-scaled price targets with horizon-dependent evaluation (24h / 2wk / 3mo); module weights adapt by live hit rate</w:t>
-      </w:r>
-    </w:p>
-    <w:p>
-      <w:pPr>
-        <w:pStyle w:val="ListParagraph"/>
-        <w:numPr>
-          <w:ilvl w:val="0"/>
-          <w:numId w:val="2"/>
-        </w:numPr>
-        <w:spacing w:after="28" w:before="28"/>
-      </w:pPr>
-      <w:r>
-        <w:rPr>
-          <w:rFonts w:ascii="Calibri" w:cs="Calibri" w:eastAsia="Calibri" w:hAnsi="Calibri"/>
-          <w:color w:val="1A1A1A"/>
-          <w:sz w:val="20"/>
-          <w:szCs w:val="20"/>
-        </w:rPr>
-        <w:t xml:space="preserve">FastAPI server (api.q-signals.com) with per-client rate limiting, API key auth, CORS hardening; DQN weights persisted to Supabase as base64 state_dict for cross-session continuity</w:t>
-      </w:r>
-    </w:p>
-    <w:p>
-      <w:pPr>
-        <w:pStyle w:val="ListParagraph"/>
-        <w:numPr>
-          <w:ilvl w:val="0"/>
-          <w:numId w:val="2"/>
-        </w:numPr>
-        <w:spacing w:after="28" w:before="28"/>
-      </w:pPr>
-      <w:r>
-        <w:rPr>
-          <w:rFonts w:ascii="Calibri" w:cs="Calibri" w:eastAsia="Calibri" w:hAnsi="Calibri"/>
-          <w:color w:val="1A1A1A"/>
-          <w:sz w:val="20"/>
-          <w:szCs w:val="20"/>
-        </w:rPr>
-        <w:t xml:space="preserve">Android app built with Capacitor 6 (War Room dashboard); static site deployed on Cloudflare Pages; AdSense + GA4 + Search Console integrated</w:t>
+        <w:t xml:space="preserve">Python · PyTorch · FastAPI · Supabase · Stripe · Capacitor 6 · Android · HTML / CSS / JS</w:t>
+      </w:r>
+    </w:p>
+    <w:p>
+      <w:pPr>
+        <w:pStyle w:val="ListParagraph"/>
+        <w:numPr>
+          <w:ilvl w:val="0"/>
+          <w:numId w:val="2"/>
+        </w:numPr>
+        <w:spacing w:after="28" w:before="28"/>
+      </w:pPr>
+      <w:r>
+        <w:rPr>
+          <w:rFonts w:ascii="Calibri" w:cs="Calibri" w:eastAsia="Calibri" w:hAnsi="Calibri"/>
+          <w:color w:val="1A1A1A"/>
+          <w:sz w:val="20"/>
+          <w:szCs w:val="20"/>
+        </w:rPr>
+        <w:t xml:space="preserve">Built an algorithmic sentiment research platform rating stocks and futures bullish / bearish / neutral — structured as a research publisher, not investment advice</w:t>
+      </w:r>
+    </w:p>
+    <w:p>
+      <w:pPr>
+        <w:pStyle w:val="ListParagraph"/>
+        <w:numPr>
+          <w:ilvl w:val="0"/>
+          <w:numId w:val="2"/>
+        </w:numPr>
+        <w:spacing w:after="28" w:before="28"/>
+      </w:pPr>
+      <w:r>
+        <w:rPr>
+          <w:rFonts w:ascii="Calibri" w:cs="Calibri" w:eastAsia="Calibri" w:hAnsi="Calibri"/>
+          <w:color w:val="1A1A1A"/>
+          <w:sz w:val="20"/>
+          <w:szCs w:val="20"/>
+        </w:rPr>
+        <w:t xml:space="preserve">Dual-Gate Consensus: rating published only when |composite score| &gt;= +/-0.10 AND 60%+ of 41 modules agree — eliminates false positives from any single noisy indicator</w:t>
+      </w:r>
+    </w:p>
+    <w:p>
+      <w:pPr>
+        <w:pStyle w:val="ListParagraph"/>
+        <w:numPr>
+          <w:ilvl w:val="0"/>
+          <w:numId w:val="2"/>
+        </w:numPr>
+        <w:spacing w:after="28" w:before="28"/>
+      </w:pPr>
+      <w:r>
+        <w:rPr>
+          <w:rFonts w:ascii="Calibri" w:cs="Calibri" w:eastAsia="Calibri" w:hAnsi="Calibri"/>
+          <w:color w:val="1A1A1A"/>
+          <w:sz w:val="20"/>
+          <w:szCs w:val="20"/>
+        </w:rPr>
+        <w:t xml:space="preserve">41 modules span Elliott Wave, Fibonacci, 61 TA-Lib candlestick patterns, SEC EDGAR insider/institutional filings, FRED macro data, Reddit/StockTwits sentiment, and earnings surprise</w:t>
+      </w:r>
+    </w:p>
+    <w:p>
+      <w:pPr>
+        <w:pStyle w:val="ListParagraph"/>
+        <w:numPr>
+          <w:ilvl w:val="0"/>
+          <w:numId w:val="2"/>
+        </w:numPr>
+        <w:spacing w:after="28" w:before="28"/>
+      </w:pPr>
+      <w:r>
+        <w:rPr>
+          <w:rFonts w:ascii="Calibri" w:cs="Calibri" w:eastAsia="Calibri" w:hAnsi="Calibri"/>
+          <w:color w:val="1A1A1A"/>
+          <w:sz w:val="20"/>
+          <w:szCs w:val="20"/>
+        </w:rPr>
+        <w:t xml:space="preserve">DQN agent (18K parameters, PyTorch) evaluates sentiment accuracy against T1/T2/T3 ATR-scaled price targets across 24h / 2wk / 3mo horizons; module weights adapt by hit rate</w:t>
+      </w:r>
+    </w:p>
+    <w:p>
+      <w:pPr>
+        <w:pStyle w:val="ListParagraph"/>
+        <w:numPr>
+          <w:ilvl w:val="0"/>
+          <w:numId w:val="2"/>
+        </w:numPr>
+        <w:spacing w:after="28" w:before="28"/>
+      </w:pPr>
+      <w:r>
+        <w:rPr>
+          <w:rFonts w:ascii="Calibri" w:cs="Calibri" w:eastAsia="Calibri" w:hAnsi="Calibri"/>
+          <w:color w:val="1A1A1A"/>
+          <w:sz w:val="20"/>
+          <w:szCs w:val="20"/>
+        </w:rPr>
+        <w:t xml:space="preserve">FastAPI server (api.q-signals.com) with rate limiting, API key auth, CORS hardening; Stripe subscription billing; Supabase persistence; Android War Room app via Capacitor 6</w:t>
       </w:r>
     </w:p>
     <w:p>
@@ -691,7 +691,7 @@
         </w:rPr>
         <w:t xml:space="preserve">	</w:t>
       </w:r>
-      <w:hyperlink w:history="1" r:id="rIdlraba3v99o_bxqtkwl_qk">
+      <w:hyperlink w:history="1" r:id="rIdr2-lngrn7hkz3-cvdzzhe">
         <w:r>
           <w:rPr>
             <w:rFonts w:ascii="Calibri" w:cs="Calibri" w:eastAsia="Calibri" w:hAnsi="Calibri"/>
@@ -839,7 +839,7 @@
         </w:rPr>
         <w:t xml:space="preserve">	</w:t>
       </w:r>
-      <w:hyperlink w:history="1" r:id="rIdvc2ve6d3vbgtwzswi0zsp">
+      <w:hyperlink w:history="1" r:id="rIdgsbobsisqddufg1lhnkrz">
         <w:r>
           <w:rPr>
             <w:rFonts w:ascii="Calibri" w:cs="Calibri" w:eastAsia="Calibri" w:hAnsi="Calibri"/>
@@ -930,7 +930,7 @@
         </w:rPr>
         <w:t xml:space="preserve">	</w:t>
       </w:r>
-      <w:hyperlink w:history="1" r:id="rIdle67jkj4-ygty3m9ijlnn">
+      <w:hyperlink w:history="1" r:id="rIdakddiepjkfqok_peusaax">
         <w:r>
           <w:rPr>
             <w:rFonts w:ascii="Calibri" w:cs="Calibri" w:eastAsia="Calibri" w:hAnsi="Calibri"/>

</xml_diff>